<commit_message>
how-to: the deck's words checked against the desk, and the templates' too
Every bulk item needs a link (a title alone stops at No link); the Add
button counts; Claude tidies an event's or opportunity's Description and
moves the date, time and place to their fields; the practice queue shows
nothing until Claude is done, then the row as the Queue draws it; the
Exchange carries what Kate publishes. The upload templates say the same,
name ERC Event, and lose their dashes and the To review line.

Co-Authored-By: Claude Fable 5.1 <noreply@anthropic.com>
</commit_message>
<xml_diff>
--- a/templates/erc-upload-template.docx
+++ b/templates/erc-upload-template.docx
@@ -16,7 +16,7 @@
           <w:sz w:val="32"/>
           <w:szCs w:val="32"/>
         </w:rPr>
-        <w:t xml:space="preserve">ERC Content Desk — bulk upload template</w:t>
+        <w:t xml:space="preserve">ERC Content Desk: bulk upload template</w:t>
       </w:r>
     </w:p>
     <w:p>
@@ -31,7 +31,7 @@
           <w:sz w:val="22"/>
           <w:szCs w:val="22"/>
         </w:rPr>
-        <w:t xml:space="preserve">Fill in one block per item, then drop this file into the bulk upload box on the ERC Content Desk. Copy the blank block as many times as you need and delete the examples before uploading.</w:t>
+        <w:t xml:space="preserve">Fill in one block per item, then drop this file on Add a doc or spreadsheet, on Submit content. Copy the blank block as many times as you need and delete the examples before uploading.</w:t>
       </w:r>
     </w:p>
     <w:p>
@@ -46,7 +46,7 @@
           <w:sz w:val="22"/>
           <w:szCs w:val="22"/>
         </w:rPr>
-        <w:t xml:space="preserve">Only Title or Link is required — leave anything else blank. Types: New Ed Policy Research, Event, Opportunity, Headline. Items without a type land in Sort under "To review".</w:t>
+        <w:t xml:space="preserve">Every item needs a link. Leave anything else blank. Types: ERC Event, New Ed Policy Research, Event, Opportunity, Headline. Items without a type are fine: Kate sets it.</w:t>
       </w:r>
     </w:p>
     <w:p>
@@ -417,7 +417,7 @@
           <w:sz w:val="22"/>
           <w:szCs w:val="22"/>
         </w:rPr>
-        <w:t xml:space="preserve">Doing several of one kind? Put a heading with the type above them and skip the Type line — everything under the heading gets that type.</w:t>
+        <w:t xml:space="preserve">Doing several of one kind? Put a heading with the type above them and skip the Type line: everything under the heading gets that type.</w:t>
       </w:r>
     </w:p>
     <w:p>

</xml_diff>